<commit_message>
docs: refresh 0.7.2 manual
</commit_message>
<xml_diff>
--- a/manual/可塑性记忆-使用手册-0.7.2.docx
+++ b/manual/可塑性记忆-使用手册-0.7.2.docx
@@ -5048,6 +5048,73 @@
                 <w:sz w:val="18"/>
               </w:rPr>
               <w:t>摘要失败后多久再试</w:t>
+            </w:r>
+          </w:p>
+        </w:tc>
+      </w:tr>
+    </w:tbl>
+    <w:p>
+      <w:pPr>
+        <w:spacing w:after="40"/>
+      </w:pPr>
+    </w:p>
+    <w:tbl>
+      <w:tblPr>
+        <w:tblW w:type="auto" w:w="0"/>
+        <w:jc w:val="center"/>
+        <w:tblLayout w:type="autofit"/>
+        <w:tblLook w:firstColumn="1" w:firstRow="1" w:lastColumn="0" w:lastRow="0" w:noHBand="0" w:noVBand="1" w:val="04A0"/>
+      </w:tblPr>
+      <w:tblGrid>
+        <w:gridCol w:w="9412"/>
+      </w:tblGrid>
+      <w:tr>
+        <w:trPr>
+          <w:cantSplit/>
+        </w:trPr>
+        <w:tc>
+          <w:tcPr>
+            <w:tcW w:type="dxa" w:w="9298"/>
+            <w:shd w:fill="EAF6F8"/>
+            <w:tcMar>
+              <w:top w:w="140" w:type="dxa"/>
+              <w:bottom w:w="140" w:type="dxa"/>
+              <w:left w:w="180" w:type="dxa"/>
+              <w:right w:w="180" w:type="dxa"/>
+            </w:tcMar>
+            <w:tcBorders>
+              <w:top w:val="single" w:sz="4" w:color="7FD6E6"/>
+              <w:left w:val="single" w:sz="18" w:color="7FD6E6"/>
+              <w:bottom w:val="single" w:sz="4" w:color="7FD6E6"/>
+              <w:right w:val="single" w:sz="4" w:color="7FD6E6"/>
+            </w:tcBorders>
+          </w:tcPr>
+          <w:p>
+            <w:pPr>
+              <w:spacing w:after="40"/>
+            </w:pPr>
+            <w:r>
+              <w:rPr>
+                <w:rFonts w:ascii="Microsoft YaHei" w:hAnsi="Microsoft YaHei" w:eastAsia="Microsoft YaHei"/>
+                <w:b/>
+                <w:color w:val="0E5A68"/>
+                <w:sz w:val="21"/>
+              </w:rPr>
+              <w:t>低信息量摘要</w:t>
+            </w:r>
+          </w:p>
+          <w:p>
+            <w:pPr>
+              <w:spacing w:after="0" w:line="348" w:lineRule="auto"/>
+            </w:pPr>
+            <w:r>
+              <w:rPr>
+                <w:rFonts w:ascii="Microsoft YaHei" w:hAnsi="Microsoft YaHei" w:eastAsia="Microsoft YaHei"/>
+                <w:b w:val="0"/>
+                <w:color w:val="24343A"/>
+                <w:sz w:val="19"/>
+              </w:rPr>
+              <w:t>整段都是「嗯/哈/？？」这类短闲聊时，桥接不调用模型，只写一条“仅覆盖”摘要挡住更早的原文，省掉这次 token；模型生成但没有事实、话头或人物的摘要会标成“低信息量”，同样不进 prompt，但在页面上还能看到和删除。</w:t>
             </w:r>
           </w:p>
         </w:tc>

</xml_diff>